<commit_message>
Agrega localidades OSM (875 para Tampico-SLP) y reportes Word actualizados
</commit_message>
<xml_diff>
--- a/Proyectos/Tampico_SanLuis/ANALISIS_DEL_PROYECTO.docx
+++ b/Proyectos/Tampico_SanLuis/ANALISIS_DEL_PROYECTO.docx
@@ -12,11 +12,8 @@
       </w:r>
     </w:p>
     <w:p>
-      <w:pPr>
-        <w:jc w:val="center"/>
-      </w:pPr>
       <w:r>
-        <w:t>Fecha de generación: 23 de March de 2026</w:t>
+        <w:t>Fecha: 23 de March de 2026</w:t>
       </w:r>
     </w:p>
     <w:p/>
@@ -30,13 +27,7 @@
     </w:p>
     <w:p>
       <w:r>
-        <w:t xml:space="preserve">El proyecto Tampico-San Luis Potosí consiste en un corredor de canalización </w:t>
-        <w:br/>
-        <w:t xml:space="preserve">de aproximadamente 300+ km que atraviesa tierras agrícolas y ejidales en los estados </w:t>
-        <w:br/>
-        <w:t xml:space="preserve">de Tamaulipas y San Luis Potosí. Los trabajos incluyen canalización tipo minicepa, </w:t>
-        <w:br/>
-        <w:t>tipo A y piedra bola, así como instalación de postes de CFE.</w:t>
+        <w:t>Corredor de canalización de ~300+ km en Tamaulipas y San Luis Potosí.</w:t>
       </w:r>
     </w:p>
     <w:p>
@@ -44,7 +35,7 @@
         <w:pStyle w:val="Heading1"/>
       </w:pPr>
       <w:r>
-        <w:t>2. Estados y Municipios Cubiertos</w:t>
+        <w:t>2. Estados y Municipios</w:t>
       </w:r>
     </w:p>
     <w:p>
@@ -52,17 +43,12 @@
         <w:pStyle w:val="Heading2"/>
       </w:pPr>
       <w:r>
-        <w:t>Estado: Tamaulipas</w:t>
+        <w:t xml:space="preserve">  Tamaulipas (CVE: 30)</w:t>
       </w:r>
     </w:p>
     <w:p>
       <w:r>
-        <w:t>Código INEGI: 30</w:t>
-      </w:r>
-    </w:p>
-    <w:p>
-      <w:r>
-        <w:t>Municipios principales: Aldama, Güémez, San Fernando, Valle Hermoso, Río Bravo</w:t>
+        <w:t>Municipios: Aldama, Güémez, San Fernando, Valle Hermoso</w:t>
       </w:r>
     </w:p>
     <w:p>
@@ -70,17 +56,12 @@
         <w:pStyle w:val="Heading2"/>
       </w:pPr>
       <w:r>
-        <w:t>Estado: San Luis Potosí</w:t>
+        <w:t xml:space="preserve">  San Luis Potosí (CVE: 24)</w:t>
       </w:r>
     </w:p>
     <w:p>
       <w:r>
-        <w:t>Código INEGI: 24</w:t>
-      </w:r>
-    </w:p>
-    <w:p>
-      <w:r>
-        <w:t>Municipios principales: Ciudad Valles, Tamazunchale, Ébano, San Vicente</w:t>
+        <w:t>Municipios: Ciudad Valles, Tamazunchale, Ébano</w:t>
       </w:r>
     </w:p>
     <w:p>
@@ -98,7 +79,7 @@
     </w:p>
     <w:p>
       <w:r>
-        <w:t>Longitud total aproximada: 412.2 km</w:t>
+        <w:t>Longitud total: 412.2 km</w:t>
       </w:r>
     </w:p>
     <w:p>
@@ -106,7 +87,7 @@
         <w:pStyle w:val="Heading3"/>
       </w:pPr>
       <w:r>
-        <w:t>Lista de Bloques:</w:t>
+        <w:t xml:space="preserve">  Lista de Bloques</w:t>
       </w:r>
     </w:p>
     <w:tbl>
@@ -137,7 +118,7 @@
           </w:tcPr>
           <w:p>
             <w:r>
-              <w:t>Longitud (km)</w:t>
+              <w:t>km</w:t>
             </w:r>
           </w:p>
         </w:tc>
@@ -632,10 +613,170 @@
           </w:p>
         </w:tc>
       </w:tr>
+      <w:tr>
+        <w:tc>
+          <w:tcPr>
+            <w:tcW w:type="dxa" w:w="2880"/>
+          </w:tcPr>
+          <w:p>
+            <w:r>
+              <w:t>014 Canalizacion tipo A</w:t>
+            </w:r>
+          </w:p>
+        </w:tc>
+        <w:tc>
+          <w:tcPr>
+            <w:tcW w:type="dxa" w:w="2880"/>
+          </w:tcPr>
+          <w:p>
+            <w:r>
+              <w:t>5.1</w:t>
+            </w:r>
+          </w:p>
+        </w:tc>
+        <w:tc>
+          <w:tcPr>
+            <w:tcW w:type="dxa" w:w="2880"/>
+          </w:tcPr>
+          <w:p>
+            <w:r>
+              <w:t>3</w:t>
+            </w:r>
+          </w:p>
+        </w:tc>
+      </w:tr>
+      <w:tr>
+        <w:tc>
+          <w:tcPr>
+            <w:tcW w:type="dxa" w:w="2880"/>
+          </w:tcPr>
+          <w:p>
+            <w:r>
+              <w:t>015 Canalizacion minicepa</w:t>
+            </w:r>
+          </w:p>
+        </w:tc>
+        <w:tc>
+          <w:tcPr>
+            <w:tcW w:type="dxa" w:w="2880"/>
+          </w:tcPr>
+          <w:p>
+            <w:r>
+              <w:t>1.2</w:t>
+            </w:r>
+          </w:p>
+        </w:tc>
+        <w:tc>
+          <w:tcPr>
+            <w:tcW w:type="dxa" w:w="2880"/>
+          </w:tcPr>
+          <w:p>
+            <w:r>
+              <w:t>3</w:t>
+            </w:r>
+          </w:p>
+        </w:tc>
+      </w:tr>
+      <w:tr>
+        <w:tc>
+          <w:tcPr>
+            <w:tcW w:type="dxa" w:w="2880"/>
+          </w:tcPr>
+          <w:p>
+            <w:r>
+              <w:t>016 Canalizacion tipo A</w:t>
+            </w:r>
+          </w:p>
+        </w:tc>
+        <w:tc>
+          <w:tcPr>
+            <w:tcW w:type="dxa" w:w="2880"/>
+          </w:tcPr>
+          <w:p>
+            <w:r>
+              <w:t>3.2</w:t>
+            </w:r>
+          </w:p>
+        </w:tc>
+        <w:tc>
+          <w:tcPr>
+            <w:tcW w:type="dxa" w:w="2880"/>
+          </w:tcPr>
+          <w:p>
+            <w:r>
+              <w:t>3</w:t>
+            </w:r>
+          </w:p>
+        </w:tc>
+      </w:tr>
+      <w:tr>
+        <w:tc>
+          <w:tcPr>
+            <w:tcW w:type="dxa" w:w="2880"/>
+          </w:tcPr>
+          <w:p>
+            <w:r>
+              <w:t>016 Canalizacion tipo A</w:t>
+            </w:r>
+          </w:p>
+        </w:tc>
+        <w:tc>
+          <w:tcPr>
+            <w:tcW w:type="dxa" w:w="2880"/>
+          </w:tcPr>
+          <w:p>
+            <w:r>
+              <w:t>4.9</w:t>
+            </w:r>
+          </w:p>
+        </w:tc>
+        <w:tc>
+          <w:tcPr>
+            <w:tcW w:type="dxa" w:w="2880"/>
+          </w:tcPr>
+          <w:p>
+            <w:r>
+              <w:t>4</w:t>
+            </w:r>
+          </w:p>
+        </w:tc>
+      </w:tr>
+      <w:tr>
+        <w:tc>
+          <w:tcPr>
+            <w:tcW w:type="dxa" w:w="2880"/>
+          </w:tcPr>
+          <w:p>
+            <w:r>
+              <w:t>017 Canalizacion tipo A</w:t>
+            </w:r>
+          </w:p>
+        </w:tc>
+        <w:tc>
+          <w:tcPr>
+            <w:tcW w:type="dxa" w:w="2880"/>
+          </w:tcPr>
+          <w:p>
+            <w:r>
+              <w:t>7.2</w:t>
+            </w:r>
+          </w:p>
+        </w:tc>
+        <w:tc>
+          <w:tcPr>
+            <w:tcW w:type="dxa" w:w="2880"/>
+          </w:tcPr>
+          <w:p>
+            <w:r>
+              <w:t>4</w:t>
+            </w:r>
+          </w:p>
+        </w:tc>
+      </w:tr>
     </w:tbl>
     <w:p>
       <w:r>
-        <w:t>... y 30 bloques más</w:t>
+        <w:t>... y 25 bloques más</w:t>
       </w:r>
     </w:p>
     <w:p>
@@ -648,7 +789,7 @@
     </w:p>
     <w:p>
       <w:r>
-        <w:t>Total de ejidos identificados a 2 km: 160</w:t>
+        <w:t>Total de ejidos a 2 km del corredor: 160</w:t>
       </w:r>
     </w:p>
     <w:p>
@@ -666,7 +807,7 @@
         <w:pStyle w:val="Heading3"/>
       </w:pPr>
       <w:r>
-        <w:t>Ejidos Más Cercanos al Corredor:</w:t>
+        <w:t xml:space="preserve">  Ejidos Más Cercanos</w:t>
       </w:r>
     </w:p>
     <w:tbl>
@@ -688,7 +829,7 @@
           </w:tcPr>
           <w:p>
             <w:r>
-              <w:t>Nombre del Ejido</w:t>
+              <w:t>Nombre</w:t>
             </w:r>
           </w:p>
         </w:tc>
@@ -708,7 +849,7 @@
           </w:tcPr>
           <w:p>
             <w:r>
-              <w:t>Distancia (km)</w:t>
+              <w:t>Dist km</w:t>
             </w:r>
           </w:p>
         </w:tc>
@@ -1353,223 +1494,13 @@
           </w:p>
         </w:tc>
       </w:tr>
-      <w:tr>
-        <w:tc>
-          <w:tcPr>
-            <w:tcW w:type="dxa" w:w="2160"/>
-          </w:tcPr>
-          <w:p>
-            <w:r>
-              <w:t>nan</w:t>
-            </w:r>
-          </w:p>
-        </w:tc>
-        <w:tc>
-          <w:tcPr>
-            <w:tcW w:type="dxa" w:w="2160"/>
-          </w:tcPr>
-          <w:p>
-            <w:r>
-              <w:t>3</w:t>
-            </w:r>
-          </w:p>
-        </w:tc>
-        <w:tc>
-          <w:tcPr>
-            <w:tcW w:type="dxa" w:w="2160"/>
-          </w:tcPr>
-          <w:p>
-            <w:r>
-              <w:t>0.33</w:t>
-            </w:r>
-          </w:p>
-        </w:tc>
-        <w:tc>
-          <w:tcPr>
-            <w:tcW w:type="dxa" w:w="2160"/>
-          </w:tcPr>
-          <w:p>
-            <w:r>
-              <w:t>EL VERGEL PUERTO DE GUAYMAS</w:t>
-            </w:r>
-          </w:p>
-        </w:tc>
-      </w:tr>
-      <w:tr>
-        <w:tc>
-          <w:tcPr>
-            <w:tcW w:type="dxa" w:w="2160"/>
-          </w:tcPr>
-          <w:p>
-            <w:r>
-              <w:t>nan</w:t>
-            </w:r>
-          </w:p>
-        </w:tc>
-        <w:tc>
-          <w:tcPr>
-            <w:tcW w:type="dxa" w:w="2160"/>
-          </w:tcPr>
-          <w:p>
-            <w:r>
-              <w:t>3</w:t>
-            </w:r>
-          </w:p>
-        </w:tc>
-        <w:tc>
-          <w:tcPr>
-            <w:tcW w:type="dxa" w:w="2160"/>
-          </w:tcPr>
-          <w:p>
-            <w:r>
-              <w:t>0.38</w:t>
-            </w:r>
-          </w:p>
-        </w:tc>
-        <w:tc>
-          <w:tcPr>
-            <w:tcW w:type="dxa" w:w="2160"/>
-          </w:tcPr>
-          <w:p>
-            <w:r>
-              <w:t>LOS OTATES</w:t>
-            </w:r>
-          </w:p>
-        </w:tc>
-      </w:tr>
-      <w:tr>
-        <w:tc>
-          <w:tcPr>
-            <w:tcW w:type="dxa" w:w="2160"/>
-          </w:tcPr>
-          <w:p>
-            <w:r>
-              <w:t>nan</w:t>
-            </w:r>
-          </w:p>
-        </w:tc>
-        <w:tc>
-          <w:tcPr>
-            <w:tcW w:type="dxa" w:w="2160"/>
-          </w:tcPr>
-          <w:p>
-            <w:r>
-              <w:t>13</w:t>
-            </w:r>
-          </w:p>
-        </w:tc>
-        <w:tc>
-          <w:tcPr>
-            <w:tcW w:type="dxa" w:w="2160"/>
-          </w:tcPr>
-          <w:p>
-            <w:r>
-              <w:t>0.39</w:t>
-            </w:r>
-          </w:p>
-        </w:tc>
-        <w:tc>
-          <w:tcPr>
-            <w:tcW w:type="dxa" w:w="2160"/>
-          </w:tcPr>
-          <w:p>
-            <w:r>
-              <w:t>LA PITAHAYA</w:t>
-            </w:r>
-          </w:p>
-        </w:tc>
-      </w:tr>
-      <w:tr>
-        <w:tc>
-          <w:tcPr>
-            <w:tcW w:type="dxa" w:w="2160"/>
-          </w:tcPr>
-          <w:p>
-            <w:r>
-              <w:t>nan</w:t>
-            </w:r>
-          </w:p>
-        </w:tc>
-        <w:tc>
-          <w:tcPr>
-            <w:tcW w:type="dxa" w:w="2160"/>
-          </w:tcPr>
-          <w:p>
-            <w:r>
-              <w:t>35</w:t>
-            </w:r>
-          </w:p>
-        </w:tc>
-        <w:tc>
-          <w:tcPr>
-            <w:tcW w:type="dxa" w:w="2160"/>
-          </w:tcPr>
-          <w:p>
-            <w:r>
-              <w:t>0.41</w:t>
-            </w:r>
-          </w:p>
-        </w:tc>
-        <w:tc>
-          <w:tcPr>
-            <w:tcW w:type="dxa" w:w="2160"/>
-          </w:tcPr>
-          <w:p>
-            <w:r>
-              <w:t>RANCHERIA DE LOS GOMEZ</w:t>
-            </w:r>
-          </w:p>
-        </w:tc>
-      </w:tr>
-      <w:tr>
-        <w:tc>
-          <w:tcPr>
-            <w:tcW w:type="dxa" w:w="2160"/>
-          </w:tcPr>
-          <w:p>
-            <w:r>
-              <w:t>CALENTADORES Y SUS ANEXOS EL BARCO Y PER</w:t>
-            </w:r>
-          </w:p>
-        </w:tc>
-        <w:tc>
-          <w:tcPr>
-            <w:tcW w:type="dxa" w:w="2160"/>
-          </w:tcPr>
-          <w:p>
-            <w:r>
-              <w:t>123</w:t>
-            </w:r>
-          </w:p>
-        </w:tc>
-        <w:tc>
-          <w:tcPr>
-            <w:tcW w:type="dxa" w:w="2160"/>
-          </w:tcPr>
-          <w:p>
-            <w:r>
-              <w:t>0.42</w:t>
-            </w:r>
-          </w:p>
-        </w:tc>
-        <w:tc>
-          <w:tcPr>
-            <w:tcW w:type="dxa" w:w="2160"/>
-          </w:tcPr>
-          <w:p>
-            <w:r>
-              <w:t>CALENTADORES Y SUS ANEXOS</w:t>
-            </w:r>
-          </w:p>
-        </w:tc>
-      </w:tr>
     </w:tbl>
     <w:p>
       <w:pPr>
         <w:pStyle w:val="Heading3"/>
       </w:pPr>
       <w:r>
-        <w:t>Distribución por Estado:</w:t>
+        <w:t xml:space="preserve">  Distribución por Estado</w:t>
       </w:r>
     </w:p>
     <w:p>
@@ -1587,7 +1518,572 @@
         <w:pStyle w:val="Heading1"/>
       </w:pPr>
       <w:r>
-        <w:t>5. Consideraciones para Vuelo de Dron</w:t>
+        <w:t>5. Localidades Cercanas (OpenStreetMap)</w:t>
+      </w:r>
+    </w:p>
+    <w:p>
+      <w:r>
+        <w:t>Total de localidades a 5 km: 875</w:t>
+      </w:r>
+    </w:p>
+    <w:p>
+      <w:r>
+        <w:t xml:space="preserve">  - Ciudades: 4</w:t>
+      </w:r>
+    </w:p>
+    <w:p>
+      <w:r>
+        <w:t xml:space="preserve">  - Pueblos: 9</w:t>
+      </w:r>
+    </w:p>
+    <w:p>
+      <w:r>
+        <w:t xml:space="preserve">  - Villages: 19</w:t>
+      </w:r>
+    </w:p>
+    <w:p>
+      <w:r>
+        <w:t xml:space="preserve">  - Hamlets: 183</w:t>
+      </w:r>
+    </w:p>
+    <w:p>
+      <w:pPr>
+        <w:pStyle w:val="Heading3"/>
+      </w:pPr>
+      <w:r>
+        <w:t xml:space="preserve">  Principales Localidades</w:t>
+      </w:r>
+    </w:p>
+    <w:tbl>
+      <w:tblPr>
+        <w:tblStyle w:val="TableGrid"/>
+        <w:tblW w:type="auto" w:w="0"/>
+        <w:tblLook w:firstColumn="1" w:firstRow="1" w:lastColumn="0" w:lastRow="0" w:noHBand="0" w:noVBand="1" w:val="04A0"/>
+      </w:tblPr>
+      <w:tblGrid>
+        <w:gridCol w:w="2880"/>
+        <w:gridCol w:w="2880"/>
+        <w:gridCol w:w="2880"/>
+      </w:tblGrid>
+      <w:tr>
+        <w:tc>
+          <w:tcPr>
+            <w:tcW w:type="dxa" w:w="2880"/>
+          </w:tcPr>
+          <w:p>
+            <w:r>
+              <w:t>Nombre</w:t>
+            </w:r>
+          </w:p>
+        </w:tc>
+        <w:tc>
+          <w:tcPr>
+            <w:tcW w:type="dxa" w:w="2880"/>
+          </w:tcPr>
+          <w:p>
+            <w:r>
+              <w:t>Tipo</w:t>
+            </w:r>
+          </w:p>
+        </w:tc>
+        <w:tc>
+          <w:tcPr>
+            <w:tcW w:type="dxa" w:w="2880"/>
+          </w:tcPr>
+          <w:p>
+            <w:r>
+              <w:t>Dist km</w:t>
+            </w:r>
+          </w:p>
+        </w:tc>
+      </w:tr>
+      <w:tr>
+        <w:tc>
+          <w:tcPr>
+            <w:tcW w:type="dxa" w:w="2880"/>
+          </w:tcPr>
+          <w:p>
+            <w:r>
+              <w:t>San Luis Potosí</w:t>
+            </w:r>
+          </w:p>
+        </w:tc>
+        <w:tc>
+          <w:tcPr>
+            <w:tcW w:type="dxa" w:w="2880"/>
+          </w:tcPr>
+          <w:p>
+            <w:r>
+              <w:t>city</w:t>
+            </w:r>
+          </w:p>
+        </w:tc>
+        <w:tc>
+          <w:tcPr>
+            <w:tcW w:type="dxa" w:w="2880"/>
+          </w:tcPr>
+          <w:p>
+            <w:r>
+              <w:t>0.00</w:t>
+            </w:r>
+          </w:p>
+        </w:tc>
+      </w:tr>
+      <w:tr>
+        <w:tc>
+          <w:tcPr>
+            <w:tcW w:type="dxa" w:w="2880"/>
+          </w:tcPr>
+          <w:p>
+            <w:r>
+              <w:t>Tampico</w:t>
+            </w:r>
+          </w:p>
+        </w:tc>
+        <w:tc>
+          <w:tcPr>
+            <w:tcW w:type="dxa" w:w="2880"/>
+          </w:tcPr>
+          <w:p>
+            <w:r>
+              <w:t>city</w:t>
+            </w:r>
+          </w:p>
+        </w:tc>
+        <w:tc>
+          <w:tcPr>
+            <w:tcW w:type="dxa" w:w="2880"/>
+          </w:tcPr>
+          <w:p>
+            <w:r>
+              <w:t>0.00</w:t>
+            </w:r>
+          </w:p>
+        </w:tc>
+      </w:tr>
+      <w:tr>
+        <w:tc>
+          <w:tcPr>
+            <w:tcW w:type="dxa" w:w="2880"/>
+          </w:tcPr>
+          <w:p>
+            <w:r>
+              <w:t>Ciudad Valles</w:t>
+            </w:r>
+          </w:p>
+        </w:tc>
+        <w:tc>
+          <w:tcPr>
+            <w:tcW w:type="dxa" w:w="2880"/>
+          </w:tcPr>
+          <w:p>
+            <w:r>
+              <w:t>city</w:t>
+            </w:r>
+          </w:p>
+        </w:tc>
+        <w:tc>
+          <w:tcPr>
+            <w:tcW w:type="dxa" w:w="2880"/>
+          </w:tcPr>
+          <w:p>
+            <w:r>
+              <w:t>0.00</w:t>
+            </w:r>
+          </w:p>
+        </w:tc>
+      </w:tr>
+      <w:tr>
+        <w:tc>
+          <w:tcPr>
+            <w:tcW w:type="dxa" w:w="2880"/>
+          </w:tcPr>
+          <w:p>
+            <w:r>
+              <w:t>Tamuín</w:t>
+            </w:r>
+          </w:p>
+        </w:tc>
+        <w:tc>
+          <w:tcPr>
+            <w:tcW w:type="dxa" w:w="2880"/>
+          </w:tcPr>
+          <w:p>
+            <w:r>
+              <w:t>town</w:t>
+            </w:r>
+          </w:p>
+        </w:tc>
+        <w:tc>
+          <w:tcPr>
+            <w:tcW w:type="dxa" w:w="2880"/>
+          </w:tcPr>
+          <w:p>
+            <w:r>
+              <w:t>0.00</w:t>
+            </w:r>
+          </w:p>
+        </w:tc>
+      </w:tr>
+      <w:tr>
+        <w:tc>
+          <w:tcPr>
+            <w:tcW w:type="dxa" w:w="2880"/>
+          </w:tcPr>
+          <w:p>
+            <w:r>
+              <w:t>Ébano</w:t>
+            </w:r>
+          </w:p>
+        </w:tc>
+        <w:tc>
+          <w:tcPr>
+            <w:tcW w:type="dxa" w:w="2880"/>
+          </w:tcPr>
+          <w:p>
+            <w:r>
+              <w:t>town</w:t>
+            </w:r>
+          </w:p>
+        </w:tc>
+        <w:tc>
+          <w:tcPr>
+            <w:tcW w:type="dxa" w:w="2880"/>
+          </w:tcPr>
+          <w:p>
+            <w:r>
+              <w:t>0.00</w:t>
+            </w:r>
+          </w:p>
+        </w:tc>
+      </w:tr>
+      <w:tr>
+        <w:tc>
+          <w:tcPr>
+            <w:tcW w:type="dxa" w:w="2880"/>
+          </w:tcPr>
+          <w:p>
+            <w:r>
+              <w:t>Rioverde</w:t>
+            </w:r>
+          </w:p>
+        </w:tc>
+        <w:tc>
+          <w:tcPr>
+            <w:tcW w:type="dxa" w:w="2880"/>
+          </w:tcPr>
+          <w:p>
+            <w:r>
+              <w:t>town</w:t>
+            </w:r>
+          </w:p>
+        </w:tc>
+        <w:tc>
+          <w:tcPr>
+            <w:tcW w:type="dxa" w:w="2880"/>
+          </w:tcPr>
+          <w:p>
+            <w:r>
+              <w:t>0.00</w:t>
+            </w:r>
+          </w:p>
+        </w:tc>
+      </w:tr>
+      <w:tr>
+        <w:tc>
+          <w:tcPr>
+            <w:tcW w:type="dxa" w:w="2880"/>
+          </w:tcPr>
+          <w:p>
+            <w:r>
+              <w:t>Rayón</w:t>
+            </w:r>
+          </w:p>
+        </w:tc>
+        <w:tc>
+          <w:tcPr>
+            <w:tcW w:type="dxa" w:w="2880"/>
+          </w:tcPr>
+          <w:p>
+            <w:r>
+              <w:t>town</w:t>
+            </w:r>
+          </w:p>
+        </w:tc>
+        <w:tc>
+          <w:tcPr>
+            <w:tcW w:type="dxa" w:w="2880"/>
+          </w:tcPr>
+          <w:p>
+            <w:r>
+              <w:t>0.00</w:t>
+            </w:r>
+          </w:p>
+        </w:tc>
+      </w:tr>
+      <w:tr>
+        <w:tc>
+          <w:tcPr>
+            <w:tcW w:type="dxa" w:w="2880"/>
+          </w:tcPr>
+          <w:p>
+            <w:r>
+              <w:t>Benito Juárez</w:t>
+            </w:r>
+          </w:p>
+        </w:tc>
+        <w:tc>
+          <w:tcPr>
+            <w:tcW w:type="dxa" w:w="2880"/>
+          </w:tcPr>
+          <w:p>
+            <w:r>
+              <w:t>village</w:t>
+            </w:r>
+          </w:p>
+        </w:tc>
+        <w:tc>
+          <w:tcPr>
+            <w:tcW w:type="dxa" w:w="2880"/>
+          </w:tcPr>
+          <w:p>
+            <w:r>
+              <w:t>0.00</w:t>
+            </w:r>
+          </w:p>
+        </w:tc>
+      </w:tr>
+      <w:tr>
+        <w:tc>
+          <w:tcPr>
+            <w:tcW w:type="dxa" w:w="2880"/>
+          </w:tcPr>
+          <w:p>
+            <w:r>
+              <w:t>Anáhuac</w:t>
+            </w:r>
+          </w:p>
+        </w:tc>
+        <w:tc>
+          <w:tcPr>
+            <w:tcW w:type="dxa" w:w="2880"/>
+          </w:tcPr>
+          <w:p>
+            <w:r>
+              <w:t>village</w:t>
+            </w:r>
+          </w:p>
+        </w:tc>
+        <w:tc>
+          <w:tcPr>
+            <w:tcW w:type="dxa" w:w="2880"/>
+          </w:tcPr>
+          <w:p>
+            <w:r>
+              <w:t>0.00</w:t>
+            </w:r>
+          </w:p>
+        </w:tc>
+      </w:tr>
+      <w:tr>
+        <w:tc>
+          <w:tcPr>
+            <w:tcW w:type="dxa" w:w="2880"/>
+          </w:tcPr>
+          <w:p>
+            <w:r>
+              <w:t>Moralillo</w:t>
+            </w:r>
+          </w:p>
+        </w:tc>
+        <w:tc>
+          <w:tcPr>
+            <w:tcW w:type="dxa" w:w="2880"/>
+          </w:tcPr>
+          <w:p>
+            <w:r>
+              <w:t>suburb</w:t>
+            </w:r>
+          </w:p>
+        </w:tc>
+        <w:tc>
+          <w:tcPr>
+            <w:tcW w:type="dxa" w:w="2880"/>
+          </w:tcPr>
+          <w:p>
+            <w:r>
+              <w:t>0.00</w:t>
+            </w:r>
+          </w:p>
+        </w:tc>
+      </w:tr>
+      <w:tr>
+        <w:tc>
+          <w:tcPr>
+            <w:tcW w:type="dxa" w:w="2880"/>
+          </w:tcPr>
+          <w:p>
+            <w:r>
+              <w:t>Hidalgo</w:t>
+            </w:r>
+          </w:p>
+        </w:tc>
+        <w:tc>
+          <w:tcPr>
+            <w:tcW w:type="dxa" w:w="2880"/>
+          </w:tcPr>
+          <w:p>
+            <w:r>
+              <w:t>village</w:t>
+            </w:r>
+          </w:p>
+        </w:tc>
+        <w:tc>
+          <w:tcPr>
+            <w:tcW w:type="dxa" w:w="2880"/>
+          </w:tcPr>
+          <w:p>
+            <w:r>
+              <w:t>0.00</w:t>
+            </w:r>
+          </w:p>
+        </w:tc>
+      </w:tr>
+      <w:tr>
+        <w:tc>
+          <w:tcPr>
+            <w:tcW w:type="dxa" w:w="2880"/>
+          </w:tcPr>
+          <w:p>
+            <w:r>
+              <w:t>Tamos</w:t>
+            </w:r>
+          </w:p>
+        </w:tc>
+        <w:tc>
+          <w:tcPr>
+            <w:tcW w:type="dxa" w:w="2880"/>
+          </w:tcPr>
+          <w:p>
+            <w:r>
+              <w:t>village</w:t>
+            </w:r>
+          </w:p>
+        </w:tc>
+        <w:tc>
+          <w:tcPr>
+            <w:tcW w:type="dxa" w:w="2880"/>
+          </w:tcPr>
+          <w:p>
+            <w:r>
+              <w:t>0.00</w:t>
+            </w:r>
+          </w:p>
+        </w:tc>
+      </w:tr>
+      <w:tr>
+        <w:tc>
+          <w:tcPr>
+            <w:tcW w:type="dxa" w:w="2880"/>
+          </w:tcPr>
+          <w:p>
+            <w:r>
+              <w:t>Villa Cacalilao (Dos)</w:t>
+            </w:r>
+          </w:p>
+        </w:tc>
+        <w:tc>
+          <w:tcPr>
+            <w:tcW w:type="dxa" w:w="2880"/>
+          </w:tcPr>
+          <w:p>
+            <w:r>
+              <w:t>village</w:t>
+            </w:r>
+          </w:p>
+        </w:tc>
+        <w:tc>
+          <w:tcPr>
+            <w:tcW w:type="dxa" w:w="2880"/>
+          </w:tcPr>
+          <w:p>
+            <w:r>
+              <w:t>0.00</w:t>
+            </w:r>
+          </w:p>
+        </w:tc>
+      </w:tr>
+      <w:tr>
+        <w:tc>
+          <w:tcPr>
+            <w:tcW w:type="dxa" w:w="2880"/>
+          </w:tcPr>
+          <w:p>
+            <w:r>
+              <w:t>Antonio J. Bermúdez</w:t>
+            </w:r>
+          </w:p>
+        </w:tc>
+        <w:tc>
+          <w:tcPr>
+            <w:tcW w:type="dxa" w:w="2880"/>
+          </w:tcPr>
+          <w:p>
+            <w:r>
+              <w:t>village</w:t>
+            </w:r>
+          </w:p>
+        </w:tc>
+        <w:tc>
+          <w:tcPr>
+            <w:tcW w:type="dxa" w:w="2880"/>
+          </w:tcPr>
+          <w:p>
+            <w:r>
+              <w:t>0.00</w:t>
+            </w:r>
+          </w:p>
+        </w:tc>
+      </w:tr>
+      <w:tr>
+        <w:tc>
+          <w:tcPr>
+            <w:tcW w:type="dxa" w:w="2880"/>
+          </w:tcPr>
+          <w:p>
+            <w:r>
+              <w:t>Confederación Nacional Campesina (C</w:t>
+            </w:r>
+          </w:p>
+        </w:tc>
+        <w:tc>
+          <w:tcPr>
+            <w:tcW w:type="dxa" w:w="2880"/>
+          </w:tcPr>
+          <w:p>
+            <w:r>
+              <w:t>village</w:t>
+            </w:r>
+          </w:p>
+        </w:tc>
+        <w:tc>
+          <w:tcPr>
+            <w:tcW w:type="dxa" w:w="2880"/>
+          </w:tcPr>
+          <w:p>
+            <w:r>
+              <w:t>0.00</w:t>
+            </w:r>
+          </w:p>
+        </w:tc>
+      </w:tr>
+    </w:tbl>
+    <w:p>
+      <w:pPr>
+        <w:pStyle w:val="Heading1"/>
+      </w:pPr>
+      <w:r>
+        <w:t>6. Consideraciones para Vuelo de Dron</w:t>
       </w:r>
     </w:p>
     <w:p>
@@ -1595,10 +2091,10 @@
         <w:rPr>
           <w:b/>
         </w:rPr>
-        <w:t xml:space="preserve">Permisos requeridos: </w:t>
+        <w:t xml:space="preserve">Permisos: </w:t>
       </w:r>
       <w:r>
-        <w:t>Consultar a la Asamblea Ejidal para autorizaciones, permiso de la SEDENA según ubicación, registro ante AFAC.</w:t>
+        <w:t>Consultar Asamblea Ejidal, SEDENA y AFAC</w:t>
       </w:r>
     </w:p>
     <w:p>
@@ -1609,7 +2105,7 @@
         <w:t xml:space="preserve">Consulta previa: </w:t>
       </w:r>
       <w:r>
-        <w:t>Es obligatorio realizar consulta con comunidades antes del vuelo, especialmente en ejidos con litigios históricos de tierra.</w:t>
+        <w:t>Contactar comunidades antes del vuelo</w:t>
       </w:r>
     </w:p>
     <w:p>
@@ -1617,10 +2113,10 @@
         <w:rPr>
           <w:b/>
         </w:rPr>
-        <w:t xml:space="preserve">Impacto social: </w:t>
+        <w:t xml:space="preserve">Zonas sensibles: </w:t>
       </w:r>
       <w:r>
-        <w:t>Identificar zonas de vivienda dispersa, escuelas rurales, centros de salud que pudieran verse afectados.</w:t>
+        <w:t>Identificar zonas urbanas y de alta concentración</w:t>
       </w:r>
     </w:p>
     <w:p>
@@ -1631,7 +2127,7 @@
         <w:t xml:space="preserve">Seguridad: </w:t>
       </w:r>
       <w:r>
-        <w:t>Coordinar con autoridades locales, identificar zonas de difícil acceso o con conflictos sociales activos.</w:t>
+        <w:t>Coordinar con autoridades locales</w:t>
       </w:r>
     </w:p>
     <w:p>
@@ -1642,7 +2138,7 @@
         <w:t xml:space="preserve">Compensación: </w:t>
       </w:r>
       <w:r>
-        <w:t>Algunos ejidos cobran tarifa por uso de tierras para actividades comerciales.</w:t>
+        <w:t>Algunos ejidos cobran por uso de tierras</w:t>
       </w:r>
     </w:p>
     <w:p>
@@ -1650,27 +2146,27 @@
         <w:pStyle w:val="Heading1"/>
       </w:pPr>
       <w:r>
-        <w:t>6. Recomendaciones de Acción</w:t>
+        <w:t>7. Acciones Recomendadas</w:t>
       </w:r>
     </w:p>
     <w:p>
       <w:r>
-        <w:t>1. Revisar el archivo CSV generado para identificar ejidos prioritarios</w:t>
+        <w:t>1. Revisar archivos CSV para identificar prioridades</w:t>
       </w:r>
     </w:p>
     <w:p>
       <w:r>
-        <w:t>2. Consultar el RAN (Registro Agrario Nacional) para verificar status legal</w:t>
+        <w:t>2. Consultar RAN para status legal de ejidos</w:t>
       </w:r>
     </w:p>
     <w:p>
       <w:r>
-        <w:t>3. Contactar a las autoridades agrarias estatales</w:t>
+        <w:t>3. Contactar autoridades agrarias estatales</w:t>
       </w:r>
     </w:p>
     <w:p>
       <w:r>
-        <w:t>4. Programar reuniones con asambleas ejidales antes del vuelo</w:t>
+        <w:t>4. Programar reuniones con asambleas ejidales</w:t>
       </w:r>
     </w:p>
     <w:p>
@@ -1679,120 +2175,36 @@
       </w:r>
     </w:p>
     <w:p>
+      <w:pPr>
+        <w:pStyle w:val="Heading1"/>
+      </w:pPr>
       <w:r>
-        <w:t>6. Identificar líderes comunales en cada zona</w:t>
+        <w:t>8. Archivos Disponibles</w:t>
       </w:r>
     </w:p>
     <w:p>
       <w:r>
-        <w:t>7. Documentar todos los permisos obtenidos</w:t>
-      </w:r>
-    </w:p>
-    <w:p>
-      <w:pPr>
-        <w:pStyle w:val="Heading1"/>
-      </w:pPr>
-      <w:r>
-        <w:t>7. Archivos Generados</w:t>
+        <w:t>Shapefiles para ArcMap:</w:t>
       </w:r>
     </w:p>
     <w:p>
       <w:r>
-        <w:t>Los siguientes archivos están disponibles en la carpeta del proyecto:</w:t>
+        <w:t xml:space="preserve">  - datos/ [corredor] .shp - Bloques del corredor</w:t>
       </w:r>
     </w:p>
     <w:p>
       <w:r>
-        <w:rPr>
-          <w:b/>
-        </w:rPr>
-        <w:t>• datos/</w:t>
-      </w:r>
-      <w:r>
-        <w:t xml:space="preserve"> - Shapefile original del corredor</w:t>
+        <w:t xml:space="preserve">  - datos/ localidades_osm.shp - Localidades OSM</w:t>
       </w:r>
     </w:p>
     <w:p>
       <w:r>
-        <w:rPr>
-          <w:b/>
-        </w:rPr>
-        <w:t>• analisis/</w:t>
-      </w:r>
-      <w:r>
-        <w:t xml:space="preserve"> - Carpeta de análisis</w:t>
+        <w:t xml:space="preserve">  - analisis/ ejidos_cercanos.csv - Lista de ejidos</w:t>
       </w:r>
     </w:p>
     <w:p>
       <w:r>
-        <w:rPr>
-          <w:b/>
-        </w:rPr>
-        <w:t>• ejidos_cercanos.csv</w:t>
-      </w:r>
-      <w:r>
-        <w:t xml:space="preserve"> - Lista de ejidos para Excel</w:t>
-      </w:r>
-    </w:p>
-    <w:p>
-      <w:r>
-        <w:rPr>
-          <w:b/>
-        </w:rPr>
-        <w:t>• ejidos_cercanos.geojson</w:t>
-      </w:r>
-      <w:r>
-        <w:t xml:space="preserve"> - Geometrías para GIS</w:t>
-      </w:r>
-    </w:p>
-    <w:p>
-      <w:r>
-        <w:rPr>
-          <w:b/>
-        </w:rPr>
-        <w:t>• ../analisis_ejidos/</w:t>
-      </w:r>
-      <w:r>
-        <w:t xml:space="preserve"> - Análisis general de ejidos</w:t>
-      </w:r>
-    </w:p>
-    <w:p>
-      <w:pPr>
-        <w:pStyle w:val="Heading1"/>
-      </w:pPr>
-      <w:r>
-        <w:t>8. Nota sobre Localidades INEGI</w:t>
-      </w:r>
-    </w:p>
-    <w:p>
-      <w:r>
-        <w:t>Para completar el análisis social, se recomienda descargar el Marco Geoestadístico de INEGI (https://www.inegi.org.mx/temas/mg/) que incluye:</w:t>
-      </w:r>
-    </w:p>
-    <w:p>
-      <w:r>
-        <w:t>• Localidades urbanas y rurales</w:t>
-      </w:r>
-    </w:p>
-    <w:p>
-      <w:r>
-        <w:t>• AGEB (Áreas Geoestadísticas Básicas)</w:t>
-      </w:r>
-    </w:p>
-    <w:p>
-      <w:r>
-        <w:t>• Manzanas en zonas urbanas</w:t>
-      </w:r>
-    </w:p>
-    <w:p>
-      <w:r>
-        <w:t>• Datos de población y vivienda</w:t>
-      </w:r>
-    </w:p>
-    <w:p/>
-    <w:p>
-      <w:r>
-        <w:t>Estos datos permiten identificar concentraciones de población que podrían verse afectadas por el vuelo de dron y planificar zonas de exclusión.</w:t>
+        <w:t xml:space="preserve">  - analisis/ localidades_cercanas.csv - Lista de localidades</w:t>
       </w:r>
     </w:p>
     <w:sectPr>

</xml_diff>